<commit_message>
Overhaul UI and refresh submission deliverables
</commit_message>
<xml_diff>
--- a/deliverables/SHORIR_AI_Technical_Report.docx
+++ b/deliverables/SHORIR_AI_Technical_Report.docx
@@ -14,7 +14,7 @@
       </w:pPr>
       <w:r>
         <w:rPr>
-          <w:rFonts w:ascii="Aptos" w:hAnsi="Aptos"/>
+          <w:rFonts w:ascii="Calibri" w:hAnsi="Calibri"/>
           <w:b/>
           <w:color w:val="1467D8"/>
           <w:sz w:val="20"/>
@@ -29,7 +29,7 @@
       </w:pPr>
       <w:r>
         <w:rPr>
-          <w:rFonts w:ascii="Aptos Display" w:hAnsi="Aptos Display"/>
+          <w:rFonts w:ascii="Calibri" w:hAnsi="Calibri"/>
           <w:b/>
           <w:color w:val="172033"/>
           <w:sz w:val="64"/>
@@ -44,7 +44,7 @@
       </w:pPr>
       <w:r>
         <w:rPr>
-          <w:rFonts w:ascii="Aptos Display" w:hAnsi="Aptos Display"/>
+          <w:rFonts w:ascii="Calibri" w:hAnsi="Calibri"/>
           <w:b w:val="0"/>
           <w:color w:val="68758A"/>
           <w:sz w:val="36"/>
@@ -98,7 +98,7 @@
       </w:pPr>
       <w:r>
         <w:rPr>
-          <w:rFonts w:ascii="Aptos" w:hAnsi="Aptos"/>
+          <w:rFonts w:ascii="Calibri" w:hAnsi="Calibri"/>
           <w:b/>
           <w:color w:val="172033"/>
           <w:sz w:val="24"/>
@@ -112,12 +112,12 @@
       </w:pPr>
       <w:r>
         <w:rPr>
-          <w:rFonts w:ascii="Aptos" w:hAnsi="Aptos"/>
+          <w:rFonts w:ascii="Calibri" w:hAnsi="Calibri"/>
           <w:b w:val="0"/>
           <w:color w:val="68758A"/>
           <w:sz w:val="21"/>
         </w:rPr>
-        <w:t>Mindsparks 26 CodeFront Challenge · AUST Innovation and Design Club</w:t>
+        <w:t>Mindsparks 26 CodeFront Challenge | AUST Innovation and Design Club</w:t>
       </w:r>
     </w:p>
     <w:p>
@@ -126,12 +126,12 @@
       </w:pPr>
       <w:r>
         <w:rPr>
-          <w:rFonts w:ascii="Aptos" w:hAnsi="Aptos"/>
+          <w:rFonts w:ascii="Calibri" w:hAnsi="Calibri"/>
           <w:b w:val="0"/>
           <w:color w:val="68758A"/>
           <w:sz w:val="21"/>
         </w:rPr>
-        <w:t>25 June 2026</w:t>
+        <w:t>26 June 2026</w:t>
       </w:r>
     </w:p>
     <w:p>
@@ -154,12 +154,12 @@
       </w:pPr>
       <w:r>
         <w:rPr>
-          <w:rFonts w:ascii="Aptos" w:hAnsi="Aptos"/>
+          <w:rFonts w:ascii="Calibri" w:hAnsi="Calibri"/>
           <w:b w:val="0"/>
           <w:color w:val="172033"/>
           <w:sz w:val="22"/>
         </w:rPr>
-        <w:t>SHORIR AI is a Bangla-first fitness companion that combines browser-side pose analysis, a bilingual exercise library, personalized workout planning, Bangladeshi diet guidance, image-based calorie review, and progress diagnostics in one coordinated product.</w:t>
+        <w:t>SHORIR AI is a Bangla-first fitness companion that combines browser-side pose analysis, a bilingual exercise library, personalized workout planning, Bangladeshi diet guidance, image-based calorie review, progress diagnostics, and a guided demo flow in one coordinated product.</w:t>
       </w:r>
     </w:p>
     <w:p>
@@ -170,7 +170,7 @@
       </w:pPr>
       <w:r>
         <w:rPr>
-          <w:rFonts w:ascii="Aptos" w:hAnsi="Aptos"/>
+          <w:rFonts w:ascii="Calibri" w:hAnsi="Calibri"/>
           <w:b/>
           <w:color w:val="1467D8"/>
           <w:sz w:val="18"/>
@@ -186,7 +186,7 @@
       </w:pPr>
       <w:r>
         <w:rPr>
-          <w:rFonts w:ascii="Aptos" w:hAnsi="Aptos"/>
+          <w:rFonts w:ascii="Calibri" w:hAnsi="Calibri"/>
           <w:b/>
           <w:color w:val="172033"/>
           <w:sz w:val="22"/>
@@ -205,12 +205,12 @@
       </w:pPr>
       <w:r>
         <w:rPr>
-          <w:rFonts w:ascii="Aptos" w:hAnsi="Aptos"/>
+          <w:rFonts w:ascii="Calibri" w:hAnsi="Calibri"/>
           <w:b w:val="0"/>
           <w:color w:val="172033"/>
           <w:sz w:val="22"/>
         </w:rPr>
-        <w:t>The system uses a React and Vite frontend, an Express API, shared TypeScript contracts, and ports-and-adapters boundaries for MediaPipe, persistence, and AI services. Raw live pose video remains in the browser. Phone video uses encrypted WebRTC, with the API handling temporary signaling metadata.</w:t>
+        <w:t>The system uses a React and Vite frontend, an Express API, shared TypeScript contracts, and ports-and-adapters boundaries for MediaPipe, persistence, and AI services. The refreshed interface uses compact navigation, shadcn-style local primitives, tabbed secondary detail, and a white-blue visual system with dark mode. Raw live pose video remains in the browser. Phone video uses encrypted WebRTC, with the API handling temporary signaling metadata.</w:t>
       </w:r>
     </w:p>
     <w:p>
@@ -228,7 +228,7 @@
       </w:pPr>
       <w:r>
         <w:rPr>
-          <w:rFonts w:ascii="Aptos" w:hAnsi="Aptos"/>
+          <w:rFonts w:ascii="Calibri" w:hAnsi="Calibri"/>
           <w:b w:val="0"/>
           <w:color w:val="172033"/>
           <w:sz w:val="22"/>
@@ -243,7 +243,7 @@
       </w:pPr>
       <w:r>
         <w:rPr>
-          <w:rFonts w:ascii="Aptos" w:hAnsi="Aptos"/>
+          <w:rFonts w:ascii="Calibri" w:hAnsi="Calibri"/>
           <w:b w:val="0"/>
           <w:color w:val="172033"/>
           <w:sz w:val="22"/>
@@ -258,7 +258,7 @@
       </w:pPr>
       <w:r>
         <w:rPr>
-          <w:rFonts w:ascii="Aptos" w:hAnsi="Aptos"/>
+          <w:rFonts w:ascii="Calibri" w:hAnsi="Calibri"/>
           <w:b w:val="0"/>
           <w:color w:val="172033"/>
           <w:sz w:val="22"/>
@@ -273,7 +273,7 @@
       </w:pPr>
       <w:r>
         <w:rPr>
-          <w:rFonts w:ascii="Aptos" w:hAnsi="Aptos"/>
+          <w:rFonts w:ascii="Calibri" w:hAnsi="Calibri"/>
           <w:b w:val="0"/>
           <w:color w:val="172033"/>
           <w:sz w:val="22"/>
@@ -288,7 +288,7 @@
       </w:pPr>
       <w:r>
         <w:rPr>
-          <w:rFonts w:ascii="Aptos" w:hAnsi="Aptos"/>
+          <w:rFonts w:ascii="Calibri" w:hAnsi="Calibri"/>
           <w:b w:val="0"/>
           <w:color w:val="172033"/>
           <w:sz w:val="22"/>
@@ -303,7 +303,7 @@
       </w:pPr>
       <w:r>
         <w:rPr>
-          <w:rFonts w:ascii="Aptos" w:hAnsi="Aptos"/>
+          <w:rFonts w:ascii="Calibri" w:hAnsi="Calibri"/>
           <w:b w:val="0"/>
           <w:color w:val="172033"/>
           <w:sz w:val="22"/>
@@ -350,7 +350,7 @@
           <w:p>
             <w:r>
               <w:rPr>
-                <w:rFonts w:ascii="Aptos" w:hAnsi="Aptos"/>
+                <w:rFonts w:ascii="Calibri" w:hAnsi="Calibri"/>
                 <w:b/>
                 <w:color w:val="172033"/>
                 <w:sz w:val="19"/>
@@ -374,7 +374,7 @@
           <w:p>
             <w:r>
               <w:rPr>
-                <w:rFonts w:ascii="Aptos" w:hAnsi="Aptos"/>
+                <w:rFonts w:ascii="Calibri" w:hAnsi="Calibri"/>
                 <w:b/>
                 <w:color w:val="172033"/>
                 <w:sz w:val="19"/>
@@ -402,7 +402,7 @@
             </w:pPr>
             <w:r>
               <w:rPr>
-                <w:rFonts w:ascii="Aptos" w:hAnsi="Aptos"/>
+                <w:rFonts w:ascii="Calibri" w:hAnsi="Calibri"/>
                 <w:b w:val="0"/>
                 <w:color w:val="172033"/>
                 <w:sz w:val="19"/>
@@ -428,7 +428,7 @@
             </w:pPr>
             <w:r>
               <w:rPr>
-                <w:rFonts w:ascii="Aptos" w:hAnsi="Aptos"/>
+                <w:rFonts w:ascii="Calibri" w:hAnsi="Calibri"/>
                 <w:b w:val="0"/>
                 <w:color w:val="172033"/>
                 <w:sz w:val="19"/>
@@ -456,7 +456,7 @@
             </w:pPr>
             <w:r>
               <w:rPr>
-                <w:rFonts w:ascii="Aptos" w:hAnsi="Aptos"/>
+                <w:rFonts w:ascii="Calibri" w:hAnsi="Calibri"/>
                 <w:b w:val="0"/>
                 <w:color w:val="172033"/>
                 <w:sz w:val="19"/>
@@ -482,7 +482,7 @@
             </w:pPr>
             <w:r>
               <w:rPr>
-                <w:rFonts w:ascii="Aptos" w:hAnsi="Aptos"/>
+                <w:rFonts w:ascii="Calibri" w:hAnsi="Calibri"/>
                 <w:b w:val="0"/>
                 <w:color w:val="172033"/>
                 <w:sz w:val="19"/>
@@ -510,7 +510,7 @@
             </w:pPr>
             <w:r>
               <w:rPr>
-                <w:rFonts w:ascii="Aptos" w:hAnsi="Aptos"/>
+                <w:rFonts w:ascii="Calibri" w:hAnsi="Calibri"/>
                 <w:b w:val="0"/>
                 <w:color w:val="172033"/>
                 <w:sz w:val="19"/>
@@ -536,7 +536,7 @@
             </w:pPr>
             <w:r>
               <w:rPr>
-                <w:rFonts w:ascii="Aptos" w:hAnsi="Aptos"/>
+                <w:rFonts w:ascii="Calibri" w:hAnsi="Calibri"/>
                 <w:b w:val="0"/>
                 <w:color w:val="172033"/>
                 <w:sz w:val="19"/>
@@ -564,7 +564,7 @@
             </w:pPr>
             <w:r>
               <w:rPr>
-                <w:rFonts w:ascii="Aptos" w:hAnsi="Aptos"/>
+                <w:rFonts w:ascii="Calibri" w:hAnsi="Calibri"/>
                 <w:b w:val="0"/>
                 <w:color w:val="172033"/>
                 <w:sz w:val="19"/>
@@ -590,7 +590,7 @@
             </w:pPr>
             <w:r>
               <w:rPr>
-                <w:rFonts w:ascii="Aptos" w:hAnsi="Aptos"/>
+                <w:rFonts w:ascii="Calibri" w:hAnsi="Calibri"/>
                 <w:b w:val="0"/>
                 <w:color w:val="172033"/>
                 <w:sz w:val="19"/>
@@ -618,7 +618,7 @@
             </w:pPr>
             <w:r>
               <w:rPr>
-                <w:rFonts w:ascii="Aptos" w:hAnsi="Aptos"/>
+                <w:rFonts w:ascii="Calibri" w:hAnsi="Calibri"/>
                 <w:b w:val="0"/>
                 <w:color w:val="172033"/>
                 <w:sz w:val="19"/>
@@ -644,7 +644,7 @@
             </w:pPr>
             <w:r>
               <w:rPr>
-                <w:rFonts w:ascii="Aptos" w:hAnsi="Aptos"/>
+                <w:rFonts w:ascii="Calibri" w:hAnsi="Calibri"/>
                 <w:b w:val="0"/>
                 <w:color w:val="172033"/>
                 <w:sz w:val="19"/>
@@ -672,7 +672,7 @@
             </w:pPr>
             <w:r>
               <w:rPr>
-                <w:rFonts w:ascii="Aptos" w:hAnsi="Aptos"/>
+                <w:rFonts w:ascii="Calibri" w:hAnsi="Calibri"/>
                 <w:b w:val="0"/>
                 <w:color w:val="172033"/>
                 <w:sz w:val="19"/>
@@ -698,12 +698,66 @@
             </w:pPr>
             <w:r>
               <w:rPr>
-                <w:rFonts w:ascii="Aptos" w:hAnsi="Aptos"/>
+                <w:rFonts w:ascii="Calibri" w:hAnsi="Calibri"/>
                 <w:b w:val="0"/>
                 <w:color w:val="172033"/>
                 <w:sz w:val="19"/>
               </w:rPr>
               <w:t>Saved sessions, review history, and detection-quality diagnostics.</w:t>
+            </w:r>
+          </w:p>
+        </w:tc>
+      </w:tr>
+      <w:tr>
+        <w:tc>
+          <w:tcPr>
+            <w:tcW w:type="dxa" w:w="2088"/>
+            <w:vAlign w:val="center"/>
+            <w:tcMar>
+              <w:top w:w="90" w:type="dxa"/>
+              <w:start w:w="120" w:type="dxa"/>
+              <w:bottom w:w="90" w:type="dxa"/>
+              <w:end w:w="120" w:type="dxa"/>
+            </w:tcMar>
+          </w:tcPr>
+          <w:p>
+            <w:pPr>
+              <w:spacing w:after="0"/>
+            </w:pPr>
+            <w:r>
+              <w:rPr>
+                <w:rFonts w:ascii="Calibri" w:hAnsi="Calibri"/>
+                <w:b w:val="0"/>
+                <w:color w:val="172033"/>
+                <w:sz w:val="19"/>
+              </w:rPr>
+              <w:t>Demo</w:t>
+            </w:r>
+          </w:p>
+        </w:tc>
+        <w:tc>
+          <w:tcPr>
+            <w:tcW w:type="dxa" w:w="7272"/>
+            <w:vAlign w:val="center"/>
+            <w:tcMar>
+              <w:top w:w="90" w:type="dxa"/>
+              <w:start w:w="120" w:type="dxa"/>
+              <w:bottom w:w="90" w:type="dxa"/>
+              <w:end w:w="120" w:type="dxa"/>
+            </w:tcMar>
+          </w:tcPr>
+          <w:p>
+            <w:pPr>
+              <w:spacing w:after="0"/>
+            </w:pPr>
+            <w:r>
+              <w:rPr>
+                <w:rFonts w:ascii="Calibri" w:hAnsi="Calibri"/>
+                <w:b w:val="0"/>
+                <w:color w:val="172033"/>
+                <w:sz w:val="19"/>
+              </w:rPr>
+              <w:t>First-time judging walkthrough, presenter script, and acceptance checks.</w:t>
             </w:r>
           </w:p>
         </w:tc>
@@ -716,7 +770,7 @@
       <w:r>
         <w:drawing>
           <wp:inline xmlns:a="http://schemas.openxmlformats.org/drawingml/2006/main" xmlns:pic="http://schemas.openxmlformats.org/drawingml/2006/picture">
-            <wp:extent cx="5943600" cy="3753853"/>
+            <wp:extent cx="5943600" cy="3797300"/>
             <wp:docPr id="2" name="Picture 2" descr="SHORIR AI coordinated dashboard"/>
             <wp:cNvGraphicFramePr>
               <a:graphicFrameLocks noChangeAspect="1"/>
@@ -725,7 +779,7 @@
               <a:graphicData uri="http://schemas.openxmlformats.org/drawingml/2006/picture">
                 <pic:pic>
                   <pic:nvPicPr>
-                    <pic:cNvPr id="0" name="home-ui.png"/>
+                    <pic:cNvPr id="0" name="01-dashboard.png"/>
                     <pic:cNvPicPr/>
                   </pic:nvPicPr>
                   <pic:blipFill>
@@ -737,7 +791,7 @@
                   <pic:spPr>
                     <a:xfrm>
                       <a:off x="0" y="0"/>
-                      <a:ext cx="5943600" cy="3753853"/>
+                      <a:ext cx="5943600" cy="3797300"/>
                     </a:xfrm>
                     <a:prstGeom prst="rect"/>
                   </pic:spPr>
@@ -755,7 +809,7 @@
       </w:pPr>
       <w:r>
         <w:rPr>
-          <w:rFonts w:ascii="Aptos" w:hAnsi="Aptos"/>
+          <w:rFonts w:ascii="Calibri" w:hAnsi="Calibri"/>
           <w:b w:val="0"/>
           <w:color w:val="68758A"/>
           <w:sz w:val="18"/>
@@ -778,7 +832,7 @@
       </w:pPr>
       <w:r>
         <w:rPr>
-          <w:rFonts w:ascii="Aptos" w:hAnsi="Aptos"/>
+          <w:rFonts w:ascii="Calibri" w:hAnsi="Calibri"/>
           <w:b w:val="0"/>
           <w:color w:val="172033"/>
           <w:sz w:val="22"/>
@@ -793,7 +847,7 @@
       </w:pPr>
       <w:r>
         <w:rPr>
-          <w:rFonts w:ascii="Aptos" w:hAnsi="Aptos"/>
+          <w:rFonts w:ascii="Calibri" w:hAnsi="Calibri"/>
           <w:b w:val="0"/>
           <w:color w:val="172033"/>
           <w:sz w:val="22"/>
@@ -808,7 +862,7 @@
       </w:pPr>
       <w:r>
         <w:rPr>
-          <w:rFonts w:ascii="Aptos" w:hAnsi="Aptos"/>
+          <w:rFonts w:ascii="Calibri" w:hAnsi="Calibri"/>
           <w:b w:val="0"/>
           <w:color w:val="172033"/>
           <w:sz w:val="22"/>
@@ -823,7 +877,7 @@
       </w:pPr>
       <w:r>
         <w:rPr>
-          <w:rFonts w:ascii="Aptos" w:hAnsi="Aptos"/>
+          <w:rFonts w:ascii="Calibri" w:hAnsi="Calibri"/>
           <w:b w:val="0"/>
           <w:color w:val="172033"/>
           <w:sz w:val="22"/>
@@ -838,7 +892,7 @@
       </w:pPr>
       <w:r>
         <w:rPr>
-          <w:rFonts w:ascii="Aptos" w:hAnsi="Aptos"/>
+          <w:rFonts w:ascii="Calibri" w:hAnsi="Calibri"/>
           <w:b w:val="0"/>
           <w:color w:val="172033"/>
           <w:sz w:val="22"/>
@@ -853,12 +907,819 @@
       </w:pPr>
       <w:r>
         <w:rPr>
-          <w:rFonts w:ascii="Aptos" w:hAnsi="Aptos"/>
+          <w:rFonts w:ascii="Calibri" w:hAnsi="Calibri"/>
           <w:b w:val="0"/>
           <w:color w:val="172033"/>
           <w:sz w:val="22"/>
         </w:rPr>
         <w:t>No route is reduced to a marketing page; the first screen remains a usable product.</w:t>
+      </w:r>
+    </w:p>
+    <w:p>
+      <w:pPr>
+        <w:pStyle w:val="Heading2"/>
+        <w:keepNext/>
+      </w:pPr>
+      <w:r>
+        <w:t>3.1 Demo Sequence</w:t>
+      </w:r>
+    </w:p>
+    <w:p>
+      <w:pPr>
+        <w:spacing w:after="160" w:line="300" w:lineRule="auto"/>
+      </w:pPr>
+      <w:r>
+        <w:rPr>
+          <w:rFonts w:ascii="Calibri" w:hAnsi="Calibri"/>
+          <w:b w:val="0"/>
+          <w:color w:val="172033"/>
+          <w:sz w:val="22"/>
+        </w:rPr>
+        <w:t>The live product now includes a dedicated /demo route. It replaces the earlier placeholder presentation/report tabs with a practical first-time walkthrough, presenter script, and acceptance checklist.</w:t>
+      </w:r>
+    </w:p>
+    <w:tbl>
+      <w:tblPr>
+        <w:tblW w:type="auto" w:w="0"/>
+        <w:jc w:val="center"/>
+        <w:tblLayout w:type="fixed"/>
+        <w:tblLook w:firstColumn="1" w:firstRow="1" w:lastColumn="0" w:lastRow="0" w:noHBand="0" w:noVBand="1" w:val="04A0"/>
+      </w:tblPr>
+      <w:tblGrid>
+        <w:gridCol w:w="3120"/>
+        <w:gridCol w:w="3120"/>
+        <w:gridCol w:w="3120"/>
+      </w:tblGrid>
+      <w:tr>
+        <w:trPr>
+          <w:tblHeader w:val="true"/>
+        </w:trPr>
+        <w:tc>
+          <w:tcPr>
+            <w:tcW w:type="dxa" w:w="792"/>
+            <w:vAlign w:val="center"/>
+            <w:shd w:fill="E8EEF5"/>
+            <w:tcMar>
+              <w:top w:w="90" w:type="dxa"/>
+              <w:start w:w="120" w:type="dxa"/>
+              <w:bottom w:w="90" w:type="dxa"/>
+              <w:end w:w="120" w:type="dxa"/>
+            </w:tcMar>
+          </w:tcPr>
+          <w:p>
+            <w:r>
+              <w:rPr>
+                <w:rFonts w:ascii="Calibri" w:hAnsi="Calibri"/>
+                <w:b/>
+                <w:color w:val="172033"/>
+                <w:sz w:val="19"/>
+              </w:rPr>
+              <w:t>Step</w:t>
+            </w:r>
+          </w:p>
+        </w:tc>
+        <w:tc>
+          <w:tcPr>
+            <w:tcW w:type="dxa" w:w="3096"/>
+            <w:vAlign w:val="center"/>
+            <w:shd w:fill="E8EEF5"/>
+            <w:tcMar>
+              <w:top w:w="90" w:type="dxa"/>
+              <w:start w:w="120" w:type="dxa"/>
+              <w:bottom w:w="90" w:type="dxa"/>
+              <w:end w:w="120" w:type="dxa"/>
+            </w:tcMar>
+          </w:tcPr>
+          <w:p>
+            <w:r>
+              <w:rPr>
+                <w:rFonts w:ascii="Calibri" w:hAnsi="Calibri"/>
+                <w:b/>
+                <w:color w:val="172033"/>
+                <w:sz w:val="19"/>
+              </w:rPr>
+              <w:t>Route</w:t>
+            </w:r>
+          </w:p>
+        </w:tc>
+        <w:tc>
+          <w:tcPr>
+            <w:tcW w:type="dxa" w:w="5472"/>
+            <w:vAlign w:val="center"/>
+            <w:shd w:fill="E8EEF5"/>
+            <w:tcMar>
+              <w:top w:w="90" w:type="dxa"/>
+              <w:start w:w="120" w:type="dxa"/>
+              <w:bottom w:w="90" w:type="dxa"/>
+              <w:end w:w="120" w:type="dxa"/>
+            </w:tcMar>
+          </w:tcPr>
+          <w:p>
+            <w:r>
+              <w:rPr>
+                <w:rFonts w:ascii="Calibri" w:hAnsi="Calibri"/>
+                <w:b/>
+                <w:color w:val="172033"/>
+                <w:sz w:val="19"/>
+              </w:rPr>
+              <w:t>Purpose</w:t>
+            </w:r>
+          </w:p>
+        </w:tc>
+      </w:tr>
+      <w:tr>
+        <w:tc>
+          <w:tcPr>
+            <w:tcW w:type="dxa" w:w="792"/>
+            <w:vAlign w:val="center"/>
+            <w:tcMar>
+              <w:top w:w="90" w:type="dxa"/>
+              <w:start w:w="120" w:type="dxa"/>
+              <w:bottom w:w="90" w:type="dxa"/>
+              <w:end w:w="120" w:type="dxa"/>
+            </w:tcMar>
+          </w:tcPr>
+          <w:p>
+            <w:pPr>
+              <w:spacing w:after="0"/>
+            </w:pPr>
+            <w:r>
+              <w:rPr>
+                <w:rFonts w:ascii="Calibri" w:hAnsi="Calibri"/>
+                <w:b w:val="0"/>
+                <w:color w:val="172033"/>
+                <w:sz w:val="19"/>
+              </w:rPr>
+              <w:t>1</w:t>
+            </w:r>
+          </w:p>
+        </w:tc>
+        <w:tc>
+          <w:tcPr>
+            <w:tcW w:type="dxa" w:w="3096"/>
+            <w:vAlign w:val="center"/>
+            <w:tcMar>
+              <w:top w:w="90" w:type="dxa"/>
+              <w:start w:w="120" w:type="dxa"/>
+              <w:bottom w:w="90" w:type="dxa"/>
+              <w:end w:w="120" w:type="dxa"/>
+            </w:tcMar>
+          </w:tcPr>
+          <w:p>
+            <w:pPr>
+              <w:spacing w:after="0"/>
+            </w:pPr>
+            <w:r>
+              <w:rPr>
+                <w:rFonts w:ascii="Calibri" w:hAnsi="Calibri"/>
+                <w:b w:val="0"/>
+                <w:color w:val="172033"/>
+                <w:sz w:val="19"/>
+              </w:rPr>
+              <w:t>/onboarding</w:t>
+            </w:r>
+          </w:p>
+        </w:tc>
+        <w:tc>
+          <w:tcPr>
+            <w:tcW w:type="dxa" w:w="5472"/>
+            <w:vAlign w:val="center"/>
+            <w:tcMar>
+              <w:top w:w="90" w:type="dxa"/>
+              <w:start w:w="120" w:type="dxa"/>
+              <w:bottom w:w="90" w:type="dxa"/>
+              <w:end w:w="120" w:type="dxa"/>
+            </w:tcMar>
+          </w:tcPr>
+          <w:p>
+            <w:pPr>
+              <w:spacing w:after="0"/>
+            </w:pPr>
+            <w:r>
+              <w:rPr>
+                <w:rFonts w:ascii="Calibri" w:hAnsi="Calibri"/>
+                <w:b w:val="0"/>
+                <w:color w:val="172033"/>
+                <w:sz w:val="19"/>
+              </w:rPr>
+              <w:t>Create a clean profile.</w:t>
+            </w:r>
+          </w:p>
+        </w:tc>
+      </w:tr>
+      <w:tr>
+        <w:tc>
+          <w:tcPr>
+            <w:tcW w:type="dxa" w:w="792"/>
+            <w:vAlign w:val="center"/>
+            <w:tcMar>
+              <w:top w:w="90" w:type="dxa"/>
+              <w:start w:w="120" w:type="dxa"/>
+              <w:bottom w:w="90" w:type="dxa"/>
+              <w:end w:w="120" w:type="dxa"/>
+            </w:tcMar>
+          </w:tcPr>
+          <w:p>
+            <w:pPr>
+              <w:spacing w:after="0"/>
+            </w:pPr>
+            <w:r>
+              <w:rPr>
+                <w:rFonts w:ascii="Calibri" w:hAnsi="Calibri"/>
+                <w:b w:val="0"/>
+                <w:color w:val="172033"/>
+                <w:sz w:val="19"/>
+              </w:rPr>
+              <w:t>2</w:t>
+            </w:r>
+          </w:p>
+        </w:tc>
+        <w:tc>
+          <w:tcPr>
+            <w:tcW w:type="dxa" w:w="3096"/>
+            <w:vAlign w:val="center"/>
+            <w:tcMar>
+              <w:top w:w="90" w:type="dxa"/>
+              <w:start w:w="120" w:type="dxa"/>
+              <w:bottom w:w="90" w:type="dxa"/>
+              <w:end w:w="120" w:type="dxa"/>
+            </w:tcMar>
+          </w:tcPr>
+          <w:p>
+            <w:pPr>
+              <w:spacing w:after="0"/>
+            </w:pPr>
+            <w:r>
+              <w:rPr>
+                <w:rFonts w:ascii="Calibri" w:hAnsi="Calibri"/>
+                <w:b w:val="0"/>
+                <w:color w:val="172033"/>
+                <w:sz w:val="19"/>
+              </w:rPr>
+              <w:t>/</w:t>
+            </w:r>
+          </w:p>
+        </w:tc>
+        <w:tc>
+          <w:tcPr>
+            <w:tcW w:type="dxa" w:w="5472"/>
+            <w:vAlign w:val="center"/>
+            <w:tcMar>
+              <w:top w:w="90" w:type="dxa"/>
+              <w:start w:w="120" w:type="dxa"/>
+              <w:bottom w:w="90" w:type="dxa"/>
+              <w:end w:w="120" w:type="dxa"/>
+            </w:tcMar>
+          </w:tcPr>
+          <w:p>
+            <w:pPr>
+              <w:spacing w:after="0"/>
+            </w:pPr>
+            <w:r>
+              <w:rPr>
+                <w:rFonts w:ascii="Calibri" w:hAnsi="Calibri"/>
+                <w:b w:val="0"/>
+                <w:color w:val="172033"/>
+                <w:sz w:val="19"/>
+              </w:rPr>
+              <w:t>Review today's plan and shortcuts.</w:t>
+            </w:r>
+          </w:p>
+        </w:tc>
+      </w:tr>
+      <w:tr>
+        <w:tc>
+          <w:tcPr>
+            <w:tcW w:type="dxa" w:w="792"/>
+            <w:vAlign w:val="center"/>
+            <w:tcMar>
+              <w:top w:w="90" w:type="dxa"/>
+              <w:start w:w="120" w:type="dxa"/>
+              <w:bottom w:w="90" w:type="dxa"/>
+              <w:end w:w="120" w:type="dxa"/>
+            </w:tcMar>
+          </w:tcPr>
+          <w:p>
+            <w:pPr>
+              <w:spacing w:after="0"/>
+            </w:pPr>
+            <w:r>
+              <w:rPr>
+                <w:rFonts w:ascii="Calibri" w:hAnsi="Calibri"/>
+                <w:b w:val="0"/>
+                <w:color w:val="172033"/>
+                <w:sz w:val="19"/>
+              </w:rPr>
+              <w:t>3</w:t>
+            </w:r>
+          </w:p>
+        </w:tc>
+        <w:tc>
+          <w:tcPr>
+            <w:tcW w:type="dxa" w:w="3096"/>
+            <w:vAlign w:val="center"/>
+            <w:tcMar>
+              <w:top w:w="90" w:type="dxa"/>
+              <w:start w:w="120" w:type="dxa"/>
+              <w:bottom w:w="90" w:type="dxa"/>
+              <w:end w:w="120" w:type="dxa"/>
+            </w:tcMar>
+          </w:tcPr>
+          <w:p>
+            <w:pPr>
+              <w:spacing w:after="0"/>
+            </w:pPr>
+            <w:r>
+              <w:rPr>
+                <w:rFonts w:ascii="Calibri" w:hAnsi="Calibri"/>
+                <w:b w:val="0"/>
+                <w:color w:val="172033"/>
+                <w:sz w:val="19"/>
+              </w:rPr>
+              <w:t>/coach?exercise=squat</w:t>
+            </w:r>
+          </w:p>
+        </w:tc>
+        <w:tc>
+          <w:tcPr>
+            <w:tcW w:type="dxa" w:w="5472"/>
+            <w:vAlign w:val="center"/>
+            <w:tcMar>
+              <w:top w:w="90" w:type="dxa"/>
+              <w:start w:w="120" w:type="dxa"/>
+              <w:bottom w:w="90" w:type="dxa"/>
+              <w:end w:w="120" w:type="dxa"/>
+            </w:tcMar>
+          </w:tcPr>
+          <w:p>
+            <w:pPr>
+              <w:spacing w:after="0"/>
+            </w:pPr>
+            <w:r>
+              <w:rPr>
+                <w:rFonts w:ascii="Calibri" w:hAnsi="Calibri"/>
+                <w:b w:val="0"/>
+                <w:color w:val="172033"/>
+                <w:sz w:val="19"/>
+              </w:rPr>
+              <w:t>Show strict live rep coaching.</w:t>
+            </w:r>
+          </w:p>
+        </w:tc>
+      </w:tr>
+      <w:tr>
+        <w:tc>
+          <w:tcPr>
+            <w:tcW w:type="dxa" w:w="792"/>
+            <w:vAlign w:val="center"/>
+            <w:tcMar>
+              <w:top w:w="90" w:type="dxa"/>
+              <w:start w:w="120" w:type="dxa"/>
+              <w:bottom w:w="90" w:type="dxa"/>
+              <w:end w:w="120" w:type="dxa"/>
+            </w:tcMar>
+          </w:tcPr>
+          <w:p>
+            <w:pPr>
+              <w:spacing w:after="0"/>
+            </w:pPr>
+            <w:r>
+              <w:rPr>
+                <w:rFonts w:ascii="Calibri" w:hAnsi="Calibri"/>
+                <w:b w:val="0"/>
+                <w:color w:val="172033"/>
+                <w:sz w:val="19"/>
+              </w:rPr>
+              <w:t>4</w:t>
+            </w:r>
+          </w:p>
+        </w:tc>
+        <w:tc>
+          <w:tcPr>
+            <w:tcW w:type="dxa" w:w="3096"/>
+            <w:vAlign w:val="center"/>
+            <w:tcMar>
+              <w:top w:w="90" w:type="dxa"/>
+              <w:start w:w="120" w:type="dxa"/>
+              <w:bottom w:w="90" w:type="dxa"/>
+              <w:end w:w="120" w:type="dxa"/>
+            </w:tcMar>
+          </w:tcPr>
+          <w:p>
+            <w:pPr>
+              <w:spacing w:after="0"/>
+            </w:pPr>
+            <w:r>
+              <w:rPr>
+                <w:rFonts w:ascii="Calibri" w:hAnsi="Calibri"/>
+                <w:b w:val="0"/>
+                <w:color w:val="172033"/>
+                <w:sz w:val="19"/>
+              </w:rPr>
+              <w:t>/exercise-library</w:t>
+            </w:r>
+          </w:p>
+        </w:tc>
+        <w:tc>
+          <w:tcPr>
+            <w:tcW w:type="dxa" w:w="5472"/>
+            <w:vAlign w:val="center"/>
+            <w:tcMar>
+              <w:top w:w="90" w:type="dxa"/>
+              <w:start w:w="120" w:type="dxa"/>
+              <w:bottom w:w="90" w:type="dxa"/>
+              <w:end w:w="120" w:type="dxa"/>
+            </w:tcMar>
+          </w:tcPr>
+          <w:p>
+            <w:pPr>
+              <w:spacing w:after="0"/>
+            </w:pPr>
+            <w:r>
+              <w:rPr>
+                <w:rFonts w:ascii="Calibri" w:hAnsi="Calibri"/>
+                <w:b w:val="0"/>
+                <w:color w:val="172033"/>
+                <w:sz w:val="19"/>
+              </w:rPr>
+              <w:t>Open movement guidance.</w:t>
+            </w:r>
+          </w:p>
+        </w:tc>
+      </w:tr>
+      <w:tr>
+        <w:tc>
+          <w:tcPr>
+            <w:tcW w:type="dxa" w:w="792"/>
+            <w:vAlign w:val="center"/>
+            <w:tcMar>
+              <w:top w:w="90" w:type="dxa"/>
+              <w:start w:w="120" w:type="dxa"/>
+              <w:bottom w:w="90" w:type="dxa"/>
+              <w:end w:w="120" w:type="dxa"/>
+            </w:tcMar>
+          </w:tcPr>
+          <w:p>
+            <w:pPr>
+              <w:spacing w:after="0"/>
+            </w:pPr>
+            <w:r>
+              <w:rPr>
+                <w:rFonts w:ascii="Calibri" w:hAnsi="Calibri"/>
+                <w:b w:val="0"/>
+                <w:color w:val="172033"/>
+                <w:sz w:val="19"/>
+              </w:rPr>
+              <w:t>5</w:t>
+            </w:r>
+          </w:p>
+        </w:tc>
+        <w:tc>
+          <w:tcPr>
+            <w:tcW w:type="dxa" w:w="3096"/>
+            <w:vAlign w:val="center"/>
+            <w:tcMar>
+              <w:top w:w="90" w:type="dxa"/>
+              <w:start w:w="120" w:type="dxa"/>
+              <w:bottom w:w="90" w:type="dxa"/>
+              <w:end w:w="120" w:type="dxa"/>
+            </w:tcMar>
+          </w:tcPr>
+          <w:p>
+            <w:pPr>
+              <w:spacing w:after="0"/>
+            </w:pPr>
+            <w:r>
+              <w:rPr>
+                <w:rFonts w:ascii="Calibri" w:hAnsi="Calibri"/>
+                <w:b w:val="0"/>
+                <w:color w:val="172033"/>
+                <w:sz w:val="19"/>
+              </w:rPr>
+              <w:t>/diet-chart</w:t>
+            </w:r>
+          </w:p>
+        </w:tc>
+        <w:tc>
+          <w:tcPr>
+            <w:tcW w:type="dxa" w:w="5472"/>
+            <w:vAlign w:val="center"/>
+            <w:tcMar>
+              <w:top w:w="90" w:type="dxa"/>
+              <w:start w:w="120" w:type="dxa"/>
+              <w:bottom w:w="90" w:type="dxa"/>
+              <w:end w:w="120" w:type="dxa"/>
+            </w:tcMar>
+          </w:tcPr>
+          <w:p>
+            <w:pPr>
+              <w:spacing w:after="0"/>
+            </w:pPr>
+            <w:r>
+              <w:rPr>
+                <w:rFonts w:ascii="Calibri" w:hAnsi="Calibri"/>
+                <w:b w:val="0"/>
+                <w:color w:val="172033"/>
+                <w:sz w:val="19"/>
+              </w:rPr>
+              <w:t>Generate local diet guidance.</w:t>
+            </w:r>
+          </w:p>
+        </w:tc>
+      </w:tr>
+      <w:tr>
+        <w:tc>
+          <w:tcPr>
+            <w:tcW w:type="dxa" w:w="792"/>
+            <w:vAlign w:val="center"/>
+            <w:tcMar>
+              <w:top w:w="90" w:type="dxa"/>
+              <w:start w:w="120" w:type="dxa"/>
+              <w:bottom w:w="90" w:type="dxa"/>
+              <w:end w:w="120" w:type="dxa"/>
+            </w:tcMar>
+          </w:tcPr>
+          <w:p>
+            <w:pPr>
+              <w:spacing w:after="0"/>
+            </w:pPr>
+            <w:r>
+              <w:rPr>
+                <w:rFonts w:ascii="Calibri" w:hAnsi="Calibri"/>
+                <w:b w:val="0"/>
+                <w:color w:val="172033"/>
+                <w:sz w:val="19"/>
+              </w:rPr>
+              <w:t>6</w:t>
+            </w:r>
+          </w:p>
+        </w:tc>
+        <w:tc>
+          <w:tcPr>
+            <w:tcW w:type="dxa" w:w="3096"/>
+            <w:vAlign w:val="center"/>
+            <w:tcMar>
+              <w:top w:w="90" w:type="dxa"/>
+              <w:start w:w="120" w:type="dxa"/>
+              <w:bottom w:w="90" w:type="dxa"/>
+              <w:end w:w="120" w:type="dxa"/>
+            </w:tcMar>
+          </w:tcPr>
+          <w:p>
+            <w:pPr>
+              <w:spacing w:after="0"/>
+            </w:pPr>
+            <w:r>
+              <w:rPr>
+                <w:rFonts w:ascii="Calibri" w:hAnsi="Calibri"/>
+                <w:b w:val="0"/>
+                <w:color w:val="172033"/>
+                <w:sz w:val="19"/>
+              </w:rPr>
+              <w:t>/calorie-check</w:t>
+            </w:r>
+          </w:p>
+        </w:tc>
+        <w:tc>
+          <w:tcPr>
+            <w:tcW w:type="dxa" w:w="5472"/>
+            <w:vAlign w:val="center"/>
+            <w:tcMar>
+              <w:top w:w="90" w:type="dxa"/>
+              <w:start w:w="120" w:type="dxa"/>
+              <w:bottom w:w="90" w:type="dxa"/>
+              <w:end w:w="120" w:type="dxa"/>
+            </w:tcMar>
+          </w:tcPr>
+          <w:p>
+            <w:pPr>
+              <w:spacing w:after="0"/>
+            </w:pPr>
+            <w:r>
+              <w:rPr>
+                <w:rFonts w:ascii="Calibri" w:hAnsi="Calibri"/>
+                <w:b w:val="0"/>
+                <w:color w:val="172033"/>
+                <w:sz w:val="19"/>
+              </w:rPr>
+              <w:t>Review calories from desktop or phone capture.</w:t>
+            </w:r>
+          </w:p>
+        </w:tc>
+      </w:tr>
+      <w:tr>
+        <w:tc>
+          <w:tcPr>
+            <w:tcW w:type="dxa" w:w="792"/>
+            <w:vAlign w:val="center"/>
+            <w:tcMar>
+              <w:top w:w="90" w:type="dxa"/>
+              <w:start w:w="120" w:type="dxa"/>
+              <w:bottom w:w="90" w:type="dxa"/>
+              <w:end w:w="120" w:type="dxa"/>
+            </w:tcMar>
+          </w:tcPr>
+          <w:p>
+            <w:pPr>
+              <w:spacing w:after="0"/>
+            </w:pPr>
+            <w:r>
+              <w:rPr>
+                <w:rFonts w:ascii="Calibri" w:hAnsi="Calibri"/>
+                <w:b w:val="0"/>
+                <w:color w:val="172033"/>
+                <w:sz w:val="19"/>
+              </w:rPr>
+              <w:t>7</w:t>
+            </w:r>
+          </w:p>
+        </w:tc>
+        <w:tc>
+          <w:tcPr>
+            <w:tcW w:type="dxa" w:w="3096"/>
+            <w:vAlign w:val="center"/>
+            <w:tcMar>
+              <w:top w:w="90" w:type="dxa"/>
+              <w:start w:w="120" w:type="dxa"/>
+              <w:bottom w:w="90" w:type="dxa"/>
+              <w:end w:w="120" w:type="dxa"/>
+            </w:tcMar>
+          </w:tcPr>
+          <w:p>
+            <w:pPr>
+              <w:spacing w:after="0"/>
+            </w:pPr>
+            <w:r>
+              <w:rPr>
+                <w:rFonts w:ascii="Calibri" w:hAnsi="Calibri"/>
+                <w:b w:val="0"/>
+                <w:color w:val="172033"/>
+                <w:sz w:val="19"/>
+              </w:rPr>
+              <w:t>/progress</w:t>
+            </w:r>
+          </w:p>
+        </w:tc>
+        <w:tc>
+          <w:tcPr>
+            <w:tcW w:type="dxa" w:w="5472"/>
+            <w:vAlign w:val="center"/>
+            <w:tcMar>
+              <w:top w:w="90" w:type="dxa"/>
+              <w:start w:w="120" w:type="dxa"/>
+              <w:bottom w:w="90" w:type="dxa"/>
+              <w:end w:w="120" w:type="dxa"/>
+            </w:tcMar>
+          </w:tcPr>
+          <w:p>
+            <w:pPr>
+              <w:spacing w:after="0"/>
+            </w:pPr>
+            <w:r>
+              <w:rPr>
+                <w:rFonts w:ascii="Calibri" w:hAnsi="Calibri"/>
+                <w:b w:val="0"/>
+                <w:color w:val="172033"/>
+                <w:sz w:val="19"/>
+              </w:rPr>
+              <w:t>Close with saved session diagnostics.</w:t>
+            </w:r>
+          </w:p>
+        </w:tc>
+      </w:tr>
+      <w:tr>
+        <w:tc>
+          <w:tcPr>
+            <w:tcW w:type="dxa" w:w="792"/>
+            <w:vAlign w:val="center"/>
+            <w:tcMar>
+              <w:top w:w="90" w:type="dxa"/>
+              <w:start w:w="120" w:type="dxa"/>
+              <w:bottom w:w="90" w:type="dxa"/>
+              <w:end w:w="120" w:type="dxa"/>
+            </w:tcMar>
+          </w:tcPr>
+          <w:p>
+            <w:pPr>
+              <w:spacing w:after="0"/>
+            </w:pPr>
+            <w:r>
+              <w:rPr>
+                <w:rFonts w:ascii="Calibri" w:hAnsi="Calibri"/>
+                <w:b w:val="0"/>
+                <w:color w:val="172033"/>
+                <w:sz w:val="19"/>
+              </w:rPr>
+              <w:t>8</w:t>
+            </w:r>
+          </w:p>
+        </w:tc>
+        <w:tc>
+          <w:tcPr>
+            <w:tcW w:type="dxa" w:w="3096"/>
+            <w:vAlign w:val="center"/>
+            <w:tcMar>
+              <w:top w:w="90" w:type="dxa"/>
+              <w:start w:w="120" w:type="dxa"/>
+              <w:bottom w:w="90" w:type="dxa"/>
+              <w:end w:w="120" w:type="dxa"/>
+            </w:tcMar>
+          </w:tcPr>
+          <w:p>
+            <w:pPr>
+              <w:spacing w:after="0"/>
+            </w:pPr>
+            <w:r>
+              <w:rPr>
+                <w:rFonts w:ascii="Calibri" w:hAnsi="Calibri"/>
+                <w:b w:val="0"/>
+                <w:color w:val="172033"/>
+                <w:sz w:val="19"/>
+              </w:rPr>
+              <w:t>/about-competition</w:t>
+            </w:r>
+          </w:p>
+        </w:tc>
+        <w:tc>
+          <w:tcPr>
+            <w:tcW w:type="dxa" w:w="5472"/>
+            <w:vAlign w:val="center"/>
+            <w:tcMar>
+              <w:top w:w="90" w:type="dxa"/>
+              <w:start w:w="120" w:type="dxa"/>
+              <w:bottom w:w="90" w:type="dxa"/>
+              <w:end w:w="120" w:type="dxa"/>
+            </w:tcMar>
+          </w:tcPr>
+          <w:p>
+            <w:pPr>
+              <w:spacing w:after="0"/>
+            </w:pPr>
+            <w:r>
+              <w:rPr>
+                <w:rFonts w:ascii="Calibri" w:hAnsi="Calibri"/>
+                <w:b w:val="0"/>
+                <w:color w:val="172033"/>
+                <w:sz w:val="19"/>
+              </w:rPr>
+              <w:t>Show submission package.</w:t>
+            </w:r>
+          </w:p>
+        </w:tc>
+      </w:tr>
+    </w:tbl>
+    <w:p>
+      <w:pPr>
+        <w:jc w:val="center"/>
+      </w:pPr>
+      <w:r>
+        <w:drawing>
+          <wp:inline xmlns:a="http://schemas.openxmlformats.org/drawingml/2006/main" xmlns:pic="http://schemas.openxmlformats.org/drawingml/2006/picture">
+            <wp:extent cx="5943600" cy="3797300"/>
+            <wp:docPr id="3" name="Picture 3" descr="SHORIR AI demo sequence"/>
+            <wp:cNvGraphicFramePr>
+              <a:graphicFrameLocks noChangeAspect="1"/>
+            </wp:cNvGraphicFramePr>
+            <a:graphic>
+              <a:graphicData uri="http://schemas.openxmlformats.org/drawingml/2006/picture">
+                <pic:pic>
+                  <pic:nvPicPr>
+                    <pic:cNvPr id="0" name="02-demo.png"/>
+                    <pic:cNvPicPr/>
+                  </pic:nvPicPr>
+                  <pic:blipFill>
+                    <a:blip r:embed="rId13"/>
+                    <a:stretch>
+                      <a:fillRect/>
+                    </a:stretch>
+                  </pic:blipFill>
+                  <pic:spPr>
+                    <a:xfrm>
+                      <a:off x="0" y="0"/>
+                      <a:ext cx="5943600" cy="3797300"/>
+                    </a:xfrm>
+                    <a:prstGeom prst="rect"/>
+                  </pic:spPr>
+                </pic:pic>
+              </a:graphicData>
+            </a:graphic>
+          </wp:inline>
+        </w:drawing>
+      </w:r>
+    </w:p>
+    <w:p>
+      <w:pPr>
+        <w:spacing w:after="200"/>
+        <w:jc w:val="center"/>
+      </w:pPr>
+      <w:r>
+        <w:rPr>
+          <w:rFonts w:ascii="Calibri" w:hAnsi="Calibri"/>
+          <w:b w:val="0"/>
+          <w:color w:val="68758A"/>
+          <w:sz w:val="18"/>
+        </w:rPr>
+        <w:t>Figure 2. First-time demo sequence with walkthrough, presenter script, and acceptance checks.</w:t>
       </w:r>
     </w:p>
     <w:p>
@@ -876,7 +1737,7 @@
       </w:pPr>
       <w:r>
         <w:rPr>
-          <w:rFonts w:ascii="Aptos" w:hAnsi="Aptos"/>
+          <w:rFonts w:ascii="Calibri" w:hAnsi="Calibri"/>
           <w:b w:val="0"/>
           <w:color w:val="172033"/>
           <w:sz w:val="22"/>
@@ -915,7 +1776,7 @@
           <w:p>
             <w:r>
               <w:rPr>
-                <w:rFonts w:ascii="Aptos" w:hAnsi="Aptos"/>
+                <w:rFonts w:ascii="Calibri" w:hAnsi="Calibri"/>
                 <w:b/>
                 <w:color w:val="172033"/>
                 <w:sz w:val="19"/>
@@ -939,7 +1800,7 @@
           <w:p>
             <w:r>
               <w:rPr>
-                <w:rFonts w:ascii="Aptos" w:hAnsi="Aptos"/>
+                <w:rFonts w:ascii="Calibri" w:hAnsi="Calibri"/>
                 <w:b/>
                 <w:color w:val="172033"/>
                 <w:sz w:val="19"/>
@@ -963,7 +1824,7 @@
           <w:p>
             <w:r>
               <w:rPr>
-                <w:rFonts w:ascii="Aptos" w:hAnsi="Aptos"/>
+                <w:rFonts w:ascii="Calibri" w:hAnsi="Calibri"/>
                 <w:b/>
                 <w:color w:val="172033"/>
                 <w:sz w:val="19"/>
@@ -991,7 +1852,7 @@
             </w:pPr>
             <w:r>
               <w:rPr>
-                <w:rFonts w:ascii="Aptos" w:hAnsi="Aptos"/>
+                <w:rFonts w:ascii="Calibri" w:hAnsi="Calibri"/>
                 <w:b w:val="0"/>
                 <w:color w:val="172033"/>
                 <w:sz w:val="19"/>
@@ -1017,7 +1878,7 @@
             </w:pPr>
             <w:r>
               <w:rPr>
-                <w:rFonts w:ascii="Aptos" w:hAnsi="Aptos"/>
+                <w:rFonts w:ascii="Calibri" w:hAnsi="Calibri"/>
                 <w:b w:val="0"/>
                 <w:color w:val="172033"/>
                 <w:sz w:val="19"/>
@@ -1043,7 +1904,7 @@
             </w:pPr>
             <w:r>
               <w:rPr>
-                <w:rFonts w:ascii="Aptos" w:hAnsi="Aptos"/>
+                <w:rFonts w:ascii="Calibri" w:hAnsi="Calibri"/>
                 <w:b w:val="0"/>
                 <w:color w:val="172033"/>
                 <w:sz w:val="19"/>
@@ -1071,7 +1932,7 @@
             </w:pPr>
             <w:r>
               <w:rPr>
-                <w:rFonts w:ascii="Aptos" w:hAnsi="Aptos"/>
+                <w:rFonts w:ascii="Calibri" w:hAnsi="Calibri"/>
                 <w:b w:val="0"/>
                 <w:color w:val="172033"/>
                 <w:sz w:val="19"/>
@@ -1097,7 +1958,7 @@
             </w:pPr>
             <w:r>
               <w:rPr>
-                <w:rFonts w:ascii="Aptos" w:hAnsi="Aptos"/>
+                <w:rFonts w:ascii="Calibri" w:hAnsi="Calibri"/>
                 <w:b w:val="0"/>
                 <w:color w:val="172033"/>
                 <w:sz w:val="19"/>
@@ -1123,7 +1984,7 @@
             </w:pPr>
             <w:r>
               <w:rPr>
-                <w:rFonts w:ascii="Aptos" w:hAnsi="Aptos"/>
+                <w:rFonts w:ascii="Calibri" w:hAnsi="Calibri"/>
                 <w:b w:val="0"/>
                 <w:color w:val="172033"/>
                 <w:sz w:val="19"/>
@@ -1151,7 +2012,7 @@
             </w:pPr>
             <w:r>
               <w:rPr>
-                <w:rFonts w:ascii="Aptos" w:hAnsi="Aptos"/>
+                <w:rFonts w:ascii="Calibri" w:hAnsi="Calibri"/>
                 <w:b w:val="0"/>
                 <w:color w:val="172033"/>
                 <w:sz w:val="19"/>
@@ -1177,7 +2038,7 @@
             </w:pPr>
             <w:r>
               <w:rPr>
-                <w:rFonts w:ascii="Aptos" w:hAnsi="Aptos"/>
+                <w:rFonts w:ascii="Calibri" w:hAnsi="Calibri"/>
                 <w:b w:val="0"/>
                 <w:color w:val="172033"/>
                 <w:sz w:val="19"/>
@@ -1203,7 +2064,7 @@
             </w:pPr>
             <w:r>
               <w:rPr>
-                <w:rFonts w:ascii="Aptos" w:hAnsi="Aptos"/>
+                <w:rFonts w:ascii="Calibri" w:hAnsi="Calibri"/>
                 <w:b w:val="0"/>
                 <w:color w:val="172033"/>
                 <w:sz w:val="19"/>
@@ -1231,7 +2092,7 @@
             </w:pPr>
             <w:r>
               <w:rPr>
-                <w:rFonts w:ascii="Aptos" w:hAnsi="Aptos"/>
+                <w:rFonts w:ascii="Calibri" w:hAnsi="Calibri"/>
                 <w:b w:val="0"/>
                 <w:color w:val="172033"/>
                 <w:sz w:val="19"/>
@@ -1257,7 +2118,7 @@
             </w:pPr>
             <w:r>
               <w:rPr>
-                <w:rFonts w:ascii="Aptos" w:hAnsi="Aptos"/>
+                <w:rFonts w:ascii="Calibri" w:hAnsi="Calibri"/>
                 <w:b w:val="0"/>
                 <w:color w:val="172033"/>
                 <w:sz w:val="19"/>
@@ -1283,7 +2144,7 @@
             </w:pPr>
             <w:r>
               <w:rPr>
-                <w:rFonts w:ascii="Aptos" w:hAnsi="Aptos"/>
+                <w:rFonts w:ascii="Calibri" w:hAnsi="Calibri"/>
                 <w:b w:val="0"/>
                 <w:color w:val="172033"/>
                 <w:sz w:val="19"/>
@@ -1311,7 +2172,7 @@
             </w:pPr>
             <w:r>
               <w:rPr>
-                <w:rFonts w:ascii="Aptos" w:hAnsi="Aptos"/>
+                <w:rFonts w:ascii="Calibri" w:hAnsi="Calibri"/>
                 <w:b w:val="0"/>
                 <w:color w:val="172033"/>
                 <w:sz w:val="19"/>
@@ -1337,7 +2198,7 @@
             </w:pPr>
             <w:r>
               <w:rPr>
-                <w:rFonts w:ascii="Aptos" w:hAnsi="Aptos"/>
+                <w:rFonts w:ascii="Calibri" w:hAnsi="Calibri"/>
                 <w:b w:val="0"/>
                 <w:color w:val="172033"/>
                 <w:sz w:val="19"/>
@@ -1363,7 +2224,7 @@
             </w:pPr>
             <w:r>
               <w:rPr>
-                <w:rFonts w:ascii="Aptos" w:hAnsi="Aptos"/>
+                <w:rFonts w:ascii="Calibri" w:hAnsi="Calibri"/>
                 <w:b w:val="0"/>
                 <w:color w:val="172033"/>
                 <w:sz w:val="19"/>
@@ -1391,7 +2252,7 @@
             </w:pPr>
             <w:r>
               <w:rPr>
-                <w:rFonts w:ascii="Aptos" w:hAnsi="Aptos"/>
+                <w:rFonts w:ascii="Calibri" w:hAnsi="Calibri"/>
                 <w:b w:val="0"/>
                 <w:color w:val="172033"/>
                 <w:sz w:val="19"/>
@@ -1417,7 +2278,7 @@
             </w:pPr>
             <w:r>
               <w:rPr>
-                <w:rFonts w:ascii="Aptos" w:hAnsi="Aptos"/>
+                <w:rFonts w:ascii="Calibri" w:hAnsi="Calibri"/>
                 <w:b w:val="0"/>
                 <w:color w:val="172033"/>
                 <w:sz w:val="19"/>
@@ -1443,7 +2304,7 @@
             </w:pPr>
             <w:r>
               <w:rPr>
-                <w:rFonts w:ascii="Aptos" w:hAnsi="Aptos"/>
+                <w:rFonts w:ascii="Calibri" w:hAnsi="Calibri"/>
                 <w:b w:val="0"/>
                 <w:color w:val="172033"/>
                 <w:sz w:val="19"/>
@@ -1461,7 +2322,7 @@
       </w:pPr>
       <w:r>
         <w:rPr>
-          <w:rFonts w:ascii="Aptos" w:hAnsi="Aptos"/>
+          <w:rFonts w:ascii="Calibri" w:hAnsi="Calibri"/>
           <w:b w:val="0"/>
           <w:color w:val="172033"/>
           <w:sz w:val="22"/>
@@ -1476,7 +2337,7 @@
       </w:pPr>
       <w:r>
         <w:rPr>
-          <w:rFonts w:ascii="Aptos" w:hAnsi="Aptos"/>
+          <w:rFonts w:ascii="Calibri" w:hAnsi="Calibri"/>
           <w:b w:val="0"/>
           <w:color w:val="172033"/>
           <w:sz w:val="22"/>
@@ -1491,7 +2352,7 @@
       </w:pPr>
       <w:r>
         <w:rPr>
-          <w:rFonts w:ascii="Aptos" w:hAnsi="Aptos"/>
+          <w:rFonts w:ascii="Calibri" w:hAnsi="Calibri"/>
           <w:b w:val="0"/>
           <w:color w:val="172033"/>
           <w:sz w:val="22"/>
@@ -1506,7 +2367,7 @@
       </w:pPr>
       <w:r>
         <w:rPr>
-          <w:rFonts w:ascii="Aptos" w:hAnsi="Aptos"/>
+          <w:rFonts w:ascii="Calibri" w:hAnsi="Calibri"/>
           <w:b w:val="0"/>
           <w:color w:val="172033"/>
           <w:sz w:val="22"/>
@@ -1521,7 +2382,7 @@
       </w:pPr>
       <w:r>
         <w:rPr>
-          <w:rFonts w:ascii="Aptos" w:hAnsi="Aptos"/>
+          <w:rFonts w:ascii="Calibri" w:hAnsi="Calibri"/>
           <w:b w:val="0"/>
           <w:color w:val="172033"/>
           <w:sz w:val="22"/>
@@ -1544,7 +2405,7 @@
       </w:pPr>
       <w:r>
         <w:rPr>
-          <w:rFonts w:ascii="Aptos" w:hAnsi="Aptos"/>
+          <w:rFonts w:ascii="Calibri" w:hAnsi="Calibri"/>
           <w:b w:val="0"/>
           <w:color w:val="172033"/>
           <w:sz w:val="22"/>
@@ -1568,7 +2429,7 @@
       </w:pPr>
       <w:r>
         <w:rPr>
-          <w:rFonts w:ascii="Aptos" w:hAnsi="Aptos"/>
+          <w:rFonts w:ascii="Calibri" w:hAnsi="Calibri"/>
           <w:b w:val="0"/>
           <w:color w:val="172033"/>
           <w:sz w:val="22"/>
@@ -1583,7 +2444,7 @@
       </w:pPr>
       <w:r>
         <w:rPr>
-          <w:rFonts w:ascii="Aptos" w:hAnsi="Aptos"/>
+          <w:rFonts w:ascii="Calibri" w:hAnsi="Calibri"/>
           <w:b w:val="0"/>
           <w:color w:val="172033"/>
           <w:sz w:val="22"/>
@@ -1598,7 +2459,7 @@
       </w:pPr>
       <w:r>
         <w:rPr>
-          <w:rFonts w:ascii="Aptos" w:hAnsi="Aptos"/>
+          <w:rFonts w:ascii="Calibri" w:hAnsi="Calibri"/>
           <w:b w:val="0"/>
           <w:color w:val="172033"/>
           <w:sz w:val="22"/>
@@ -1613,7 +2474,7 @@
       </w:pPr>
       <w:r>
         <w:rPr>
-          <w:rFonts w:ascii="Aptos" w:hAnsi="Aptos"/>
+          <w:rFonts w:ascii="Calibri" w:hAnsi="Calibri"/>
           <w:b w:val="0"/>
           <w:color w:val="172033"/>
           <w:sz w:val="22"/>
@@ -1628,7 +2489,7 @@
       </w:pPr>
       <w:r>
         <w:rPr>
-          <w:rFonts w:ascii="Aptos" w:hAnsi="Aptos"/>
+          <w:rFonts w:ascii="Calibri" w:hAnsi="Calibri"/>
           <w:b w:val="0"/>
           <w:color w:val="172033"/>
           <w:sz w:val="22"/>
@@ -1643,7 +2504,7 @@
       </w:pPr>
       <w:r>
         <w:rPr>
-          <w:rFonts w:ascii="Aptos" w:hAnsi="Aptos"/>
+          <w:rFonts w:ascii="Calibri" w:hAnsi="Calibri"/>
           <w:b w:val="0"/>
           <w:color w:val="172033"/>
           <w:sz w:val="22"/>
@@ -1666,7 +2527,7 @@
       </w:pPr>
       <w:r>
         <w:rPr>
-          <w:rFonts w:ascii="Aptos" w:hAnsi="Aptos"/>
+          <w:rFonts w:ascii="Calibri" w:hAnsi="Calibri"/>
           <w:b w:val="0"/>
           <w:color w:val="172033"/>
           <w:sz w:val="22"/>
@@ -1681,8 +2542,8 @@
       <w:r>
         <w:drawing>
           <wp:inline xmlns:a="http://schemas.openxmlformats.org/drawingml/2006/main" xmlns:pic="http://schemas.openxmlformats.org/drawingml/2006/picture">
-            <wp:extent cx="5943600" cy="3753853"/>
-            <wp:docPr id="3" name="Picture 3" descr="SHORIR AI live pose coach"/>
+            <wp:extent cx="5943600" cy="3797300"/>
+            <wp:docPr id="4" name="Picture 4" descr="SHORIR AI live pose coach"/>
             <wp:cNvGraphicFramePr>
               <a:graphicFrameLocks noChangeAspect="1"/>
             </wp:cNvGraphicFramePr>
@@ -1690,11 +2551,11 @@
               <a:graphicData uri="http://schemas.openxmlformats.org/drawingml/2006/picture">
                 <pic:pic>
                   <pic:nvPicPr>
-                    <pic:cNvPr id="0" name="coach-ui.png"/>
+                    <pic:cNvPr id="0" name="03-coach.png"/>
                     <pic:cNvPicPr/>
                   </pic:nvPicPr>
                   <pic:blipFill>
-                    <a:blip r:embed="rId13"/>
+                    <a:blip r:embed="rId14"/>
                     <a:stretch>
                       <a:fillRect/>
                     </a:stretch>
@@ -1702,7 +2563,7 @@
                   <pic:spPr>
                     <a:xfrm>
                       <a:off x="0" y="0"/>
-                      <a:ext cx="5943600" cy="3753853"/>
+                      <a:ext cx="5943600" cy="3797300"/>
                     </a:xfrm>
                     <a:prstGeom prst="rect"/>
                   </pic:spPr>
@@ -1720,12 +2581,12 @@
       </w:pPr>
       <w:r>
         <w:rPr>
-          <w:rFonts w:ascii="Aptos" w:hAnsi="Aptos"/>
+          <w:rFonts w:ascii="Calibri" w:hAnsi="Calibri"/>
           <w:b w:val="0"/>
           <w:color w:val="68758A"/>
           <w:sz w:val="18"/>
         </w:rPr>
-        <w:t>Figure 2. Live squat coach with activity stage, movement guide, and strict analyzer controls.</w:t>
+        <w:t>Figure 3. Live squat coach with activity stage, compact readout rail, and hidden detail tabs.</w:t>
       </w:r>
     </w:p>
     <w:p>
@@ -1767,7 +2628,7 @@
           <w:p>
             <w:r>
               <w:rPr>
-                <w:rFonts w:ascii="Aptos" w:hAnsi="Aptos"/>
+                <w:rFonts w:ascii="Calibri" w:hAnsi="Calibri"/>
                 <w:b/>
                 <w:color w:val="172033"/>
                 <w:sz w:val="19"/>
@@ -1791,7 +2652,7 @@
           <w:p>
             <w:r>
               <w:rPr>
-                <w:rFonts w:ascii="Aptos" w:hAnsi="Aptos"/>
+                <w:rFonts w:ascii="Calibri" w:hAnsi="Calibri"/>
                 <w:b/>
                 <w:color w:val="172033"/>
                 <w:sz w:val="19"/>
@@ -1819,7 +2680,7 @@
             </w:pPr>
             <w:r>
               <w:rPr>
-                <w:rFonts w:ascii="Aptos" w:hAnsi="Aptos"/>
+                <w:rFonts w:ascii="Calibri" w:hAnsi="Calibri"/>
                 <w:b w:val="0"/>
                 <w:color w:val="172033"/>
                 <w:sz w:val="19"/>
@@ -1845,7 +2706,7 @@
             </w:pPr>
             <w:r>
               <w:rPr>
-                <w:rFonts w:ascii="Aptos" w:hAnsi="Aptos"/>
+                <w:rFonts w:ascii="Calibri" w:hAnsi="Calibri"/>
                 <w:b w:val="0"/>
                 <w:color w:val="172033"/>
                 <w:sz w:val="19"/>
@@ -1873,7 +2734,7 @@
             </w:pPr>
             <w:r>
               <w:rPr>
-                <w:rFonts w:ascii="Aptos" w:hAnsi="Aptos"/>
+                <w:rFonts w:ascii="Calibri" w:hAnsi="Calibri"/>
                 <w:b w:val="0"/>
                 <w:color w:val="172033"/>
                 <w:sz w:val="19"/>
@@ -1899,7 +2760,7 @@
             </w:pPr>
             <w:r>
               <w:rPr>
-                <w:rFonts w:ascii="Aptos" w:hAnsi="Aptos"/>
+                <w:rFonts w:ascii="Calibri" w:hAnsi="Calibri"/>
                 <w:b w:val="0"/>
                 <w:color w:val="172033"/>
                 <w:sz w:val="19"/>
@@ -1927,7 +2788,7 @@
             </w:pPr>
             <w:r>
               <w:rPr>
-                <w:rFonts w:ascii="Aptos" w:hAnsi="Aptos"/>
+                <w:rFonts w:ascii="Calibri" w:hAnsi="Calibri"/>
                 <w:b w:val="0"/>
                 <w:color w:val="172033"/>
                 <w:sz w:val="19"/>
@@ -1953,7 +2814,7 @@
             </w:pPr>
             <w:r>
               <w:rPr>
-                <w:rFonts w:ascii="Aptos" w:hAnsi="Aptos"/>
+                <w:rFonts w:ascii="Calibri" w:hAnsi="Calibri"/>
                 <w:b w:val="0"/>
                 <w:color w:val="172033"/>
                 <w:sz w:val="19"/>
@@ -1972,7 +2833,7 @@
       </w:pPr>
       <w:r>
         <w:rPr>
-          <w:rFonts w:ascii="Aptos" w:hAnsi="Aptos"/>
+          <w:rFonts w:ascii="Calibri" w:hAnsi="Calibri"/>
           <w:b/>
           <w:color w:val="1467D8"/>
           <w:sz w:val="18"/>
@@ -1988,7 +2849,7 @@
       </w:pPr>
       <w:r>
         <w:rPr>
-          <w:rFonts w:ascii="Aptos" w:hAnsi="Aptos"/>
+          <w:rFonts w:ascii="Calibri" w:hAnsi="Calibri"/>
           <w:b/>
           <w:color w:val="172033"/>
           <w:sz w:val="22"/>
@@ -2016,7 +2877,7 @@
       </w:pPr>
       <w:r>
         <w:rPr>
-          <w:rFonts w:ascii="Aptos" w:hAnsi="Aptos"/>
+          <w:rFonts w:ascii="Calibri" w:hAnsi="Calibri"/>
           <w:b w:val="0"/>
           <w:color w:val="172033"/>
           <w:sz w:val="22"/>
@@ -2031,7 +2892,7 @@
       </w:pPr>
       <w:r>
         <w:rPr>
-          <w:rFonts w:ascii="Aptos" w:hAnsi="Aptos"/>
+          <w:rFonts w:ascii="Calibri" w:hAnsi="Calibri"/>
           <w:b w:val="0"/>
           <w:color w:val="172033"/>
           <w:sz w:val="22"/>
@@ -2046,7 +2907,7 @@
       </w:pPr>
       <w:r>
         <w:rPr>
-          <w:rFonts w:ascii="Aptos" w:hAnsi="Aptos"/>
+          <w:rFonts w:ascii="Calibri" w:hAnsi="Calibri"/>
           <w:b w:val="0"/>
           <w:color w:val="172033"/>
           <w:sz w:val="22"/>
@@ -2061,7 +2922,7 @@
       </w:pPr>
       <w:r>
         <w:rPr>
-          <w:rFonts w:ascii="Aptos" w:hAnsi="Aptos"/>
+          <w:rFonts w:ascii="Calibri" w:hAnsi="Calibri"/>
           <w:b w:val="0"/>
           <w:color w:val="172033"/>
           <w:sz w:val="22"/>
@@ -2076,12 +2937,66 @@
       </w:pPr>
       <w:r>
         <w:rPr>
-          <w:rFonts w:ascii="Aptos" w:hAnsi="Aptos"/>
+          <w:rFonts w:ascii="Calibri" w:hAnsi="Calibri"/>
           <w:b w:val="0"/>
           <w:color w:val="172033"/>
           <w:sz w:val="22"/>
         </w:rPr>
         <w:t>The AI response is structured and cautious, with uncertainty and next-step guidance.</w:t>
+      </w:r>
+    </w:p>
+    <w:p>
+      <w:pPr>
+        <w:jc w:val="center"/>
+      </w:pPr>
+      <w:r>
+        <w:drawing>
+          <wp:inline xmlns:a="http://schemas.openxmlformats.org/drawingml/2006/main" xmlns:pic="http://schemas.openxmlformats.org/drawingml/2006/picture">
+            <wp:extent cx="5943600" cy="3797300"/>
+            <wp:docPr id="5" name="Picture 5" descr="SHORIR AI calorie check"/>
+            <wp:cNvGraphicFramePr>
+              <a:graphicFrameLocks noChangeAspect="1"/>
+            </wp:cNvGraphicFramePr>
+            <a:graphic>
+              <a:graphicData uri="http://schemas.openxmlformats.org/drawingml/2006/picture">
+                <pic:pic>
+                  <pic:nvPicPr>
+                    <pic:cNvPr id="0" name="06-calorie.png"/>
+                    <pic:cNvPicPr/>
+                  </pic:nvPicPr>
+                  <pic:blipFill>
+                    <a:blip r:embed="rId15"/>
+                    <a:stretch>
+                      <a:fillRect/>
+                    </a:stretch>
+                  </pic:blipFill>
+                  <pic:spPr>
+                    <a:xfrm>
+                      <a:off x="0" y="0"/>
+                      <a:ext cx="5943600" cy="3797300"/>
+                    </a:xfrm>
+                    <a:prstGeom prst="rect"/>
+                  </pic:spPr>
+                </pic:pic>
+              </a:graphicData>
+            </a:graphic>
+          </wp:inline>
+        </w:drawing>
+      </w:r>
+    </w:p>
+    <w:p>
+      <w:pPr>
+        <w:spacing w:after="200"/>
+        <w:jc w:val="center"/>
+      </w:pPr>
+      <w:r>
+        <w:rPr>
+          <w:rFonts w:ascii="Calibri" w:hAnsi="Calibri"/>
+          <w:b w:val="0"/>
+          <w:color w:val="68758A"/>
+          <w:sz w:val="18"/>
+        </w:rPr>
+        <w:t>Figure 4. Calorie-check workflow with desktop and phone-capture entry points.</w:t>
       </w:r>
     </w:p>
     <w:p>
@@ -2100,7 +3015,7 @@
       </w:pPr>
       <w:r>
         <w:rPr>
-          <w:rFonts w:ascii="Aptos" w:hAnsi="Aptos"/>
+          <w:rFonts w:ascii="Calibri" w:hAnsi="Calibri"/>
           <w:b w:val="0"/>
           <w:color w:val="172033"/>
           <w:sz w:val="22"/>
@@ -2115,7 +3030,7 @@
       </w:pPr>
       <w:r>
         <w:rPr>
-          <w:rFonts w:ascii="Aptos" w:hAnsi="Aptos"/>
+          <w:rFonts w:ascii="Calibri" w:hAnsi="Calibri"/>
           <w:b w:val="0"/>
           <w:color w:val="172033"/>
           <w:sz w:val="22"/>
@@ -2130,7 +3045,7 @@
       </w:pPr>
       <w:r>
         <w:rPr>
-          <w:rFonts w:ascii="Aptos" w:hAnsi="Aptos"/>
+          <w:rFonts w:ascii="Calibri" w:hAnsi="Calibri"/>
           <w:b w:val="0"/>
           <w:color w:val="172033"/>
           <w:sz w:val="22"/>
@@ -2145,7 +3060,7 @@
       </w:pPr>
       <w:r>
         <w:rPr>
-          <w:rFonts w:ascii="Aptos" w:hAnsi="Aptos"/>
+          <w:rFonts w:ascii="Calibri" w:hAnsi="Calibri"/>
           <w:b w:val="0"/>
           <w:color w:val="172033"/>
           <w:sz w:val="22"/>
@@ -2160,7 +3075,7 @@
       </w:pPr>
       <w:r>
         <w:rPr>
-          <w:rFonts w:ascii="Aptos" w:hAnsi="Aptos"/>
+          <w:rFonts w:ascii="Calibri" w:hAnsi="Calibri"/>
           <w:b w:val="0"/>
           <w:color w:val="172033"/>
           <w:sz w:val="22"/>
@@ -2175,7 +3090,7 @@
       </w:pPr>
       <w:r>
         <w:rPr>
-          <w:rFonts w:ascii="Aptos" w:hAnsi="Aptos"/>
+          <w:rFonts w:ascii="Calibri" w:hAnsi="Calibri"/>
           <w:b w:val="0"/>
           <w:color w:val="172033"/>
           <w:sz w:val="22"/>
@@ -2198,7 +3113,7 @@
       </w:pPr>
       <w:r>
         <w:rPr>
-          <w:rFonts w:ascii="Aptos" w:hAnsi="Aptos"/>
+          <w:rFonts w:ascii="Calibri" w:hAnsi="Calibri"/>
           <w:b w:val="0"/>
           <w:color w:val="172033"/>
           <w:sz w:val="22"/>
@@ -2236,7 +3151,7 @@
           <w:p>
             <w:r>
               <w:rPr>
-                <w:rFonts w:ascii="Aptos" w:hAnsi="Aptos"/>
+                <w:rFonts w:ascii="Calibri" w:hAnsi="Calibri"/>
                 <w:b/>
                 <w:color w:val="172033"/>
                 <w:sz w:val="19"/>
@@ -2260,7 +3175,7 @@
           <w:p>
             <w:r>
               <w:rPr>
-                <w:rFonts w:ascii="Aptos" w:hAnsi="Aptos"/>
+                <w:rFonts w:ascii="Calibri" w:hAnsi="Calibri"/>
                 <w:b/>
                 <w:color w:val="172033"/>
                 <w:sz w:val="19"/>
@@ -2288,7 +3203,7 @@
             </w:pPr>
             <w:r>
               <w:rPr>
-                <w:rFonts w:ascii="Aptos" w:hAnsi="Aptos"/>
+                <w:rFonts w:ascii="Calibri" w:hAnsi="Calibri"/>
                 <w:b w:val="0"/>
                 <w:color w:val="172033"/>
                 <w:sz w:val="19"/>
@@ -2314,7 +3229,7 @@
             </w:pPr>
             <w:r>
               <w:rPr>
-                <w:rFonts w:ascii="Aptos" w:hAnsi="Aptos"/>
+                <w:rFonts w:ascii="Calibri" w:hAnsi="Calibri"/>
                 <w:b w:val="0"/>
                 <w:color w:val="172033"/>
                 <w:sz w:val="19"/>
@@ -2342,7 +3257,7 @@
             </w:pPr>
             <w:r>
               <w:rPr>
-                <w:rFonts w:ascii="Aptos" w:hAnsi="Aptos"/>
+                <w:rFonts w:ascii="Calibri" w:hAnsi="Calibri"/>
                 <w:b w:val="0"/>
                 <w:color w:val="172033"/>
                 <w:sz w:val="19"/>
@@ -2368,7 +3283,7 @@
             </w:pPr>
             <w:r>
               <w:rPr>
-                <w:rFonts w:ascii="Aptos" w:hAnsi="Aptos"/>
+                <w:rFonts w:ascii="Calibri" w:hAnsi="Calibri"/>
                 <w:b w:val="0"/>
                 <w:color w:val="172033"/>
                 <w:sz w:val="19"/>
@@ -2396,7 +3311,7 @@
             </w:pPr>
             <w:r>
               <w:rPr>
-                <w:rFonts w:ascii="Aptos" w:hAnsi="Aptos"/>
+                <w:rFonts w:ascii="Calibri" w:hAnsi="Calibri"/>
                 <w:b w:val="0"/>
                 <w:color w:val="172033"/>
                 <w:sz w:val="19"/>
@@ -2422,7 +3337,7 @@
             </w:pPr>
             <w:r>
               <w:rPr>
-                <w:rFonts w:ascii="Aptos" w:hAnsi="Aptos"/>
+                <w:rFonts w:ascii="Calibri" w:hAnsi="Calibri"/>
                 <w:b w:val="0"/>
                 <w:color w:val="172033"/>
                 <w:sz w:val="19"/>
@@ -2450,7 +3365,7 @@
             </w:pPr>
             <w:r>
               <w:rPr>
-                <w:rFonts w:ascii="Aptos" w:hAnsi="Aptos"/>
+                <w:rFonts w:ascii="Calibri" w:hAnsi="Calibri"/>
                 <w:b w:val="0"/>
                 <w:color w:val="172033"/>
                 <w:sz w:val="19"/>
@@ -2476,7 +3391,7 @@
             </w:pPr>
             <w:r>
               <w:rPr>
-                <w:rFonts w:ascii="Aptos" w:hAnsi="Aptos"/>
+                <w:rFonts w:ascii="Calibri" w:hAnsi="Calibri"/>
                 <w:b w:val="0"/>
                 <w:color w:val="172033"/>
                 <w:sz w:val="19"/>
@@ -2504,7 +3419,7 @@
             </w:pPr>
             <w:r>
               <w:rPr>
-                <w:rFonts w:ascii="Aptos" w:hAnsi="Aptos"/>
+                <w:rFonts w:ascii="Calibri" w:hAnsi="Calibri"/>
                 <w:b w:val="0"/>
                 <w:color w:val="172033"/>
                 <w:sz w:val="19"/>
@@ -2530,7 +3445,7 @@
             </w:pPr>
             <w:r>
               <w:rPr>
-                <w:rFonts w:ascii="Aptos" w:hAnsi="Aptos"/>
+                <w:rFonts w:ascii="Calibri" w:hAnsi="Calibri"/>
                 <w:b w:val="0"/>
                 <w:color w:val="172033"/>
                 <w:sz w:val="19"/>
@@ -2558,7 +3473,7 @@
             </w:pPr>
             <w:r>
               <w:rPr>
-                <w:rFonts w:ascii="Aptos" w:hAnsi="Aptos"/>
+                <w:rFonts w:ascii="Calibri" w:hAnsi="Calibri"/>
                 <w:b w:val="0"/>
                 <w:color w:val="172033"/>
                 <w:sz w:val="19"/>
@@ -2584,7 +3499,7 @@
             </w:pPr>
             <w:r>
               <w:rPr>
-                <w:rFonts w:ascii="Aptos" w:hAnsi="Aptos"/>
+                <w:rFonts w:ascii="Calibri" w:hAnsi="Calibri"/>
                 <w:b w:val="0"/>
                 <w:color w:val="172033"/>
                 <w:sz w:val="19"/>
@@ -2610,7 +3525,7 @@
       </w:pPr>
       <w:r>
         <w:rPr>
-          <w:rFonts w:ascii="Aptos" w:hAnsi="Aptos"/>
+          <w:rFonts w:ascii="Calibri" w:hAnsi="Calibri"/>
           <w:b w:val="0"/>
           <w:color w:val="172033"/>
           <w:sz w:val="22"/>
@@ -2625,7 +3540,7 @@
       </w:pPr>
       <w:r>
         <w:rPr>
-          <w:rFonts w:ascii="Aptos" w:hAnsi="Aptos"/>
+          <w:rFonts w:ascii="Calibri" w:hAnsi="Calibri"/>
           <w:b w:val="0"/>
           <w:color w:val="172033"/>
           <w:sz w:val="22"/>
@@ -2640,7 +3555,7 @@
       </w:pPr>
       <w:r>
         <w:rPr>
-          <w:rFonts w:ascii="Aptos" w:hAnsi="Aptos"/>
+          <w:rFonts w:ascii="Calibri" w:hAnsi="Calibri"/>
           <w:b w:val="0"/>
           <w:color w:val="172033"/>
           <w:sz w:val="22"/>
@@ -2655,7 +3570,7 @@
       </w:pPr>
       <w:r>
         <w:rPr>
-          <w:rFonts w:ascii="Aptos" w:hAnsi="Aptos"/>
+          <w:rFonts w:ascii="Calibri" w:hAnsi="Calibri"/>
           <w:b w:val="0"/>
           <w:color w:val="172033"/>
           <w:sz w:val="22"/>
@@ -2670,7 +3585,7 @@
       </w:pPr>
       <w:r>
         <w:rPr>
-          <w:rFonts w:ascii="Aptos" w:hAnsi="Aptos"/>
+          <w:rFonts w:ascii="Calibri" w:hAnsi="Calibri"/>
           <w:b w:val="0"/>
           <w:color w:val="172033"/>
           <w:sz w:val="22"/>
@@ -2685,7 +3600,7 @@
       </w:pPr>
       <w:r>
         <w:rPr>
-          <w:rFonts w:ascii="Aptos" w:hAnsi="Aptos"/>
+          <w:rFonts w:ascii="Calibri" w:hAnsi="Calibri"/>
           <w:b w:val="0"/>
           <w:color w:val="172033"/>
           <w:sz w:val="22"/>
@@ -2709,7 +3624,7 @@
       </w:pPr>
       <w:r>
         <w:rPr>
-          <w:rFonts w:ascii="Aptos" w:hAnsi="Aptos"/>
+          <w:rFonts w:ascii="Calibri" w:hAnsi="Calibri"/>
           <w:b w:val="0"/>
           <w:color w:val="172033"/>
           <w:sz w:val="22"/>
@@ -2724,7 +3639,7 @@
       </w:pPr>
       <w:r>
         <w:rPr>
-          <w:rFonts w:ascii="Aptos" w:hAnsi="Aptos"/>
+          <w:rFonts w:ascii="Calibri" w:hAnsi="Calibri"/>
           <w:b w:val="0"/>
           <w:color w:val="172033"/>
           <w:sz w:val="22"/>
@@ -2739,7 +3654,7 @@
       </w:pPr>
       <w:r>
         <w:rPr>
-          <w:rFonts w:ascii="Aptos" w:hAnsi="Aptos"/>
+          <w:rFonts w:ascii="Calibri" w:hAnsi="Calibri"/>
           <w:b w:val="0"/>
           <w:color w:val="172033"/>
           <w:sz w:val="22"/>
@@ -2754,7 +3669,7 @@
       </w:pPr>
       <w:r>
         <w:rPr>
-          <w:rFonts w:ascii="Aptos" w:hAnsi="Aptos"/>
+          <w:rFonts w:ascii="Calibri" w:hAnsi="Calibri"/>
           <w:b w:val="0"/>
           <w:color w:val="172033"/>
           <w:sz w:val="22"/>
@@ -2769,7 +3684,7 @@
       </w:pPr>
       <w:r>
         <w:rPr>
-          <w:rFonts w:ascii="Aptos" w:hAnsi="Aptos"/>
+          <w:rFonts w:ascii="Calibri" w:hAnsi="Calibri"/>
           <w:b w:val="0"/>
           <w:color w:val="172033"/>
           <w:sz w:val="22"/>
@@ -2784,7 +3699,7 @@
       </w:pPr>
       <w:r>
         <w:rPr>
-          <w:rFonts w:ascii="Aptos" w:hAnsi="Aptos"/>
+          <w:rFonts w:ascii="Calibri" w:hAnsi="Calibri"/>
           <w:b w:val="0"/>
           <w:color w:val="172033"/>
           <w:sz w:val="22"/>
@@ -2831,7 +3746,7 @@
           <w:p>
             <w:r>
               <w:rPr>
-                <w:rFonts w:ascii="Aptos" w:hAnsi="Aptos"/>
+                <w:rFonts w:ascii="Calibri" w:hAnsi="Calibri"/>
                 <w:b/>
                 <w:color w:val="172033"/>
                 <w:sz w:val="19"/>
@@ -2855,7 +3770,7 @@
           <w:p>
             <w:r>
               <w:rPr>
-                <w:rFonts w:ascii="Aptos" w:hAnsi="Aptos"/>
+                <w:rFonts w:ascii="Calibri" w:hAnsi="Calibri"/>
                 <w:b/>
                 <w:color w:val="172033"/>
                 <w:sz w:val="19"/>
@@ -2883,7 +3798,7 @@
             </w:pPr>
             <w:r>
               <w:rPr>
-                <w:rFonts w:ascii="Aptos" w:hAnsi="Aptos"/>
+                <w:rFonts w:ascii="Calibri" w:hAnsi="Calibri"/>
                 <w:b w:val="0"/>
                 <w:color w:val="172033"/>
                 <w:sz w:val="19"/>
@@ -2909,12 +3824,12 @@
             </w:pPr>
             <w:r>
               <w:rPr>
-                <w:rFonts w:ascii="Aptos" w:hAnsi="Aptos"/>
+                <w:rFonts w:ascii="Calibri" w:hAnsi="Calibri"/>
                 <w:b w:val="0"/>
                 <w:color w:val="172033"/>
                 <w:sz w:val="19"/>
               </w:rPr>
-              <w:t>Recorded in deliverables/SUBMISSION.md after deployment.</w:t>
+              <w:t>https://shorir-ai-production.up.railway.app</w:t>
             </w:r>
           </w:p>
         </w:tc>
@@ -2937,7 +3852,115 @@
             </w:pPr>
             <w:r>
               <w:rPr>
-                <w:rFonts w:ascii="Aptos" w:hAnsi="Aptos"/>
+                <w:rFonts w:ascii="Calibri" w:hAnsi="Calibri"/>
+                <w:b w:val="0"/>
+                <w:color w:val="172033"/>
+                <w:sz w:val="19"/>
+              </w:rPr>
+              <w:t>Demo sequence</w:t>
+            </w:r>
+          </w:p>
+        </w:tc>
+        <w:tc>
+          <w:tcPr>
+            <w:tcW w:type="dxa" w:w="6768"/>
+            <w:vAlign w:val="center"/>
+            <w:tcMar>
+              <w:top w:w="90" w:type="dxa"/>
+              <w:start w:w="120" w:type="dxa"/>
+              <w:bottom w:w="90" w:type="dxa"/>
+              <w:end w:w="120" w:type="dxa"/>
+            </w:tcMar>
+          </w:tcPr>
+          <w:p>
+            <w:pPr>
+              <w:spacing w:after="0"/>
+            </w:pPr>
+            <w:r>
+              <w:rPr>
+                <w:rFonts w:ascii="Calibri" w:hAnsi="Calibri"/>
+                <w:b w:val="0"/>
+                <w:color w:val="172033"/>
+                <w:sz w:val="19"/>
+              </w:rPr>
+              <w:t>deliverables/SHORIR_AI_Demo_Sequence.md</w:t>
+            </w:r>
+          </w:p>
+        </w:tc>
+      </w:tr>
+      <w:tr>
+        <w:tc>
+          <w:tcPr>
+            <w:tcW w:type="dxa" w:w="2592"/>
+            <w:vAlign w:val="center"/>
+            <w:tcMar>
+              <w:top w:w="90" w:type="dxa"/>
+              <w:start w:w="120" w:type="dxa"/>
+              <w:bottom w:w="90" w:type="dxa"/>
+              <w:end w:w="120" w:type="dxa"/>
+            </w:tcMar>
+          </w:tcPr>
+          <w:p>
+            <w:pPr>
+              <w:spacing w:after="0"/>
+            </w:pPr>
+            <w:r>
+              <w:rPr>
+                <w:rFonts w:ascii="Calibri" w:hAnsi="Calibri"/>
+                <w:b w:val="0"/>
+                <w:color w:val="172033"/>
+                <w:sz w:val="19"/>
+              </w:rPr>
+              <w:t>Demo video</w:t>
+            </w:r>
+          </w:p>
+        </w:tc>
+        <w:tc>
+          <w:tcPr>
+            <w:tcW w:type="dxa" w:w="6768"/>
+            <w:vAlign w:val="center"/>
+            <w:tcMar>
+              <w:top w:w="90" w:type="dxa"/>
+              <w:start w:w="120" w:type="dxa"/>
+              <w:bottom w:w="90" w:type="dxa"/>
+              <w:end w:w="120" w:type="dxa"/>
+            </w:tcMar>
+          </w:tcPr>
+          <w:p>
+            <w:pPr>
+              <w:spacing w:after="0"/>
+            </w:pPr>
+            <w:r>
+              <w:rPr>
+                <w:rFonts w:ascii="Calibri" w:hAnsi="Calibri"/>
+                <w:b w:val="0"/>
+                <w:color w:val="172033"/>
+                <w:sz w:val="19"/>
+              </w:rPr>
+              <w:t>deliverables/SHORIR_AI_Demo_Walkthrough.mp4</w:t>
+            </w:r>
+          </w:p>
+        </w:tc>
+      </w:tr>
+      <w:tr>
+        <w:tc>
+          <w:tcPr>
+            <w:tcW w:type="dxa" w:w="2592"/>
+            <w:vAlign w:val="center"/>
+            <w:tcMar>
+              <w:top w:w="90" w:type="dxa"/>
+              <w:start w:w="120" w:type="dxa"/>
+              <w:bottom w:w="90" w:type="dxa"/>
+              <w:end w:w="120" w:type="dxa"/>
+            </w:tcMar>
+          </w:tcPr>
+          <w:p>
+            <w:pPr>
+              <w:spacing w:after="0"/>
+            </w:pPr>
+            <w:r>
+              <w:rPr>
+                <w:rFonts w:ascii="Calibri" w:hAnsi="Calibri"/>
                 <w:b w:val="0"/>
                 <w:color w:val="172033"/>
                 <w:sz w:val="19"/>
@@ -2963,7 +3986,7 @@
             </w:pPr>
             <w:r>
               <w:rPr>
-                <w:rFonts w:ascii="Aptos" w:hAnsi="Aptos"/>
+                <w:rFonts w:ascii="Calibri" w:hAnsi="Calibri"/>
                 <w:b w:val="0"/>
                 <w:color w:val="172033"/>
                 <w:sz w:val="19"/>
@@ -2991,7 +4014,7 @@
             </w:pPr>
             <w:r>
               <w:rPr>
-                <w:rFonts w:ascii="Aptos" w:hAnsi="Aptos"/>
+                <w:rFonts w:ascii="Calibri" w:hAnsi="Calibri"/>
                 <w:b w:val="0"/>
                 <w:color w:val="172033"/>
                 <w:sz w:val="19"/>
@@ -3017,7 +4040,7 @@
             </w:pPr>
             <w:r>
               <w:rPr>
-                <w:rFonts w:ascii="Aptos" w:hAnsi="Aptos"/>
+                <w:rFonts w:ascii="Calibri" w:hAnsi="Calibri"/>
                 <w:b w:val="0"/>
                 <w:color w:val="172033"/>
                 <w:sz w:val="19"/>
@@ -3045,7 +4068,7 @@
             </w:pPr>
             <w:r>
               <w:rPr>
-                <w:rFonts w:ascii="Aptos" w:hAnsi="Aptos"/>
+                <w:rFonts w:ascii="Calibri" w:hAnsi="Calibri"/>
                 <w:b w:val="0"/>
                 <w:color w:val="172033"/>
                 <w:sz w:val="19"/>
@@ -3071,7 +4094,7 @@
             </w:pPr>
             <w:r>
               <w:rPr>
-                <w:rFonts w:ascii="Aptos" w:hAnsi="Aptos"/>
+                <w:rFonts w:ascii="Calibri" w:hAnsi="Calibri"/>
                 <w:b w:val="0"/>
                 <w:color w:val="172033"/>
                 <w:sz w:val="19"/>
@@ -3088,7 +4111,7 @@
       </w:pPr>
       <w:r>
         <w:rPr>
-          <w:rFonts w:ascii="Aptos" w:hAnsi="Aptos"/>
+          <w:rFonts w:ascii="Calibri" w:hAnsi="Calibri"/>
           <w:b w:val="0"/>
           <w:color w:val="172033"/>
           <w:sz w:val="22"/>
@@ -3117,12 +4140,12 @@
     </w:pPr>
     <w:r>
       <w:rPr>
-        <w:rFonts w:ascii="Aptos" w:hAnsi="Aptos"/>
+        <w:rFonts w:ascii="Calibri" w:hAnsi="Calibri"/>
         <w:b w:val="0"/>
         <w:color w:val="68758A"/>
         <w:sz w:val="17"/>
       </w:rPr>
-      <w:t>Team El Bracino · Mindsparks 26 CodeFront Challenge · June 2026</w:t>
+      <w:t>Team El Bracino | Mindsparks 26 CodeFront Challenge | June 2026</w:t>
     </w:r>
   </w:p>
 </w:ftr>
@@ -3137,7 +4160,7 @@
     </w:pPr>
     <w:r>
       <w:rPr>
-        <w:rFonts w:ascii="Aptos" w:hAnsi="Aptos"/>
+        <w:rFonts w:ascii="Calibri" w:hAnsi="Calibri"/>
         <w:b/>
         <w:color w:val="68758A"/>
         <w:sz w:val="17"/>
@@ -3515,7 +4538,7 @@
       <w:spacing w:after="160" w:line="300" w:lineRule="auto"/>
     </w:pPr>
     <w:rPr>
-      <w:rFonts w:ascii="Aptos" w:hAnsi="Aptos"/>
+      <w:rFonts w:ascii="Calibri" w:hAnsi="Calibri"/>
       <w:sz w:val="22"/>
     </w:rPr>
   </w:style>
@@ -3578,7 +4601,7 @@
       <w:outlineLvl w:val="0"/>
     </w:pPr>
     <w:rPr>
-      <w:rFonts w:asciiTheme="majorHAnsi" w:eastAsiaTheme="majorEastAsia" w:hAnsiTheme="majorHAnsi" w:cstheme="majorBidi" w:ascii="Aptos Display" w:hAnsi="Aptos Display"/>
+      <w:rFonts w:asciiTheme="majorHAnsi" w:eastAsiaTheme="majorEastAsia" w:hAnsiTheme="majorHAnsi" w:cstheme="majorBidi" w:ascii="Calibri" w:hAnsi="Calibri"/>
       <w:b/>
       <w:bCs/>
       <w:color w:val="1467D8"/>
@@ -3602,7 +4625,7 @@
       <w:outlineLvl w:val="1"/>
     </w:pPr>
     <w:rPr>
-      <w:rFonts w:asciiTheme="majorHAnsi" w:eastAsiaTheme="majorEastAsia" w:hAnsiTheme="majorHAnsi" w:cstheme="majorBidi" w:ascii="Aptos Display" w:hAnsi="Aptos Display"/>
+      <w:rFonts w:asciiTheme="majorHAnsi" w:eastAsiaTheme="majorEastAsia" w:hAnsiTheme="majorHAnsi" w:cstheme="majorBidi" w:ascii="Calibri" w:hAnsi="Calibri"/>
       <w:b/>
       <w:bCs/>
       <w:color w:val="1467D8"/>
@@ -3626,7 +4649,7 @@
       <w:outlineLvl w:val="2"/>
     </w:pPr>
     <w:rPr>
-      <w:rFonts w:asciiTheme="majorHAnsi" w:eastAsiaTheme="majorEastAsia" w:hAnsiTheme="majorHAnsi" w:cstheme="majorBidi" w:ascii="Aptos Display" w:hAnsi="Aptos Display"/>
+      <w:rFonts w:asciiTheme="majorHAnsi" w:eastAsiaTheme="majorEastAsia" w:hAnsiTheme="majorHAnsi" w:cstheme="majorBidi" w:ascii="Calibri" w:hAnsi="Calibri"/>
       <w:b/>
       <w:bCs/>
       <w:color w:val="172033"/>

</xml_diff>

<commit_message>
Redesign demo as interactive guided tour
</commit_message>
<xml_diff>
--- a/deliverables/SHORIR_AI_Technical_Report.docx
+++ b/deliverables/SHORIR_AI_Technical_Report.docx
@@ -757,7 +757,7 @@
                 <w:color w:val="172033"/>
                 <w:sz w:val="19"/>
               </w:rPr>
-              <w:t>First-time judging walkthrough, presenter script, and acceptance checks.</w:t>
+              <w:t>Interactive guided tour with real app frames, focal highlights, cursor motion, and presenter controls.</w:t>
             </w:r>
           </w:p>
         </w:tc>
@@ -935,7 +935,7 @@
           <w:color w:val="172033"/>
           <w:sz w:val="22"/>
         </w:rPr>
-        <w:t>The live product now includes a dedicated /demo route. It replaces the earlier placeholder presentation/report tabs with a practical first-time walkthrough, presenter script, and acceptance checklist.</w:t>
+        <w:t>The live product now includes a dedicated /demo route. It replaces static walkthrough panels with an auto-playing guided tour that uses real app frames, focal highlights, cursor movement, captions, and pause/back/next controls.</w:t>
       </w:r>
     </w:p>
     <w:tbl>
@@ -1719,7 +1719,7 @@
           <w:color w:val="68758A"/>
           <w:sz w:val="18"/>
         </w:rPr>
-        <w:t>Figure 2. First-time demo sequence with walkthrough, presenter script, and acceptance checks.</w:t>
+        <w:t>Figure 2. Interactive demo tour with focal highlight, cursor pointer, and presenter controls.</w:t>
       </w:r>
     </w:p>
     <w:p>

</xml_diff>

<commit_message>
Prepare El Bracino submission package
</commit_message>
<xml_diff>
--- a/deliverables/SHORIR_AI_Technical_Report.docx
+++ b/deliverables/SHORIR_AI_Technical_Report.docx
@@ -1636,7 +1636,7 @@
                 <w:color w:val="172033"/>
                 <w:sz w:val="19"/>
               </w:rPr>
-              <w:t>/about-competition</w:t>
+              <w:t>/demo?scene=submission</w:t>
             </w:r>
           </w:p>
         </w:tc>
@@ -1662,7 +1662,7 @@
                 <w:color w:val="172033"/>
                 <w:sz w:val="19"/>
               </w:rPr>
-              <w:t>Show submission package.</w:t>
+              <w:t>Close on the upload-ready submission package.</w:t>
             </w:r>
           </w:p>
         </w:tc>

</xml_diff>